<commit_message>
Atualização do Documento Completo do Projeto
</commit_message>
<xml_diff>
--- a/docs/Tutorial_SecCloud.docx
+++ b/docs/Tutorial_SecCloud.docx
@@ -5,6 +5,7 @@
     <w:tbl>
       <w:tblPr>
         <w:tblW w:w="9360" w:type="dxa"/>
+        <w:jc w:val="center"/>
         <w:tblBorders>
           <w:top w:val="single" w:sz="4" w:space="0" w:color="auto"/>
           <w:left w:val="single" w:sz="4" w:space="0" w:color="auto"/>
@@ -23,6 +24,9 @@
         <w:gridCol w:w="9360"/>
       </w:tblGrid>
       <w:tr>
+        <w:trPr>
+          <w:jc w:val="center"/>
+        </w:trPr>
         <w:tc>
           <w:tcPr>
             <w:tcW w:w="0" w:type="auto"/>
@@ -51,15 +55,7 @@
                 <w:sz w:val="72"/>
                 <w:szCs w:val="72"/>
               </w:rPr>
-              <w:t>🛡</w:t>
-            </w:r>
-            <w:r>
-              <w:rPr>
-                <w:rFonts w:ascii="Segoe UI Emoji" w:eastAsia="Segoe UI Emoji" w:hAnsi="Segoe UI Emoji" w:cs="Segoe UI Emoji"/>
-                <w:sz w:val="72"/>
-                <w:szCs w:val="72"/>
-              </w:rPr>
-              <w:t>️</w:t>
+              <w:t>🛡️</w:t>
             </w:r>
           </w:p>
           <w:p>
@@ -139,6 +135,8 @@
             </w:r>
           </w:p>
         </w:tc>
+        <w:bookmarkStart w:id="0" w:name="_GoBack"/>
+        <w:bookmarkEnd w:id="0"/>
       </w:tr>
     </w:tbl>
     <w:p>
@@ -294,10 +292,7 @@
         <w:spacing w:before="60" w:after="80"/>
       </w:pPr>
       <w:r>
-        <w:t>O proj</w:t>
-      </w:r>
-      <w:r>
-        <w:t xml:space="preserve">eto é composto por </w:t>
+        <w:t xml:space="preserve">O projeto é composto por </w:t>
       </w:r>
       <w:proofErr w:type="gramStart"/>
       <w:r>
@@ -1320,10 +1315,7 @@
         <w:t xml:space="preserve">Pré-requisito: </w:t>
       </w:r>
       <w:r>
-        <w:t xml:space="preserve">Docker Desktop em </w:t>
-      </w:r>
-      <w:r>
-        <w:t>execução</w:t>
+        <w:t>Docker Desktop em execução</w:t>
       </w:r>
     </w:p>
     <w:p>
@@ -1508,32 +1500,24 @@
                 <w:bCs/>
                 <w:color w:val="F59E0B"/>
               </w:rPr>
-              <w:t>⚠</w:t>
-            </w:r>
+              <w:t>⚠️</w:t>
+            </w:r>
+            <w:proofErr w:type="gramStart"/>
             <w:r>
               <w:rPr>
                 <w:b/>
                 <w:bCs/>
                 <w:color w:val="F59E0B"/>
               </w:rPr>
-              <w:t>️</w:t>
-            </w:r>
-            <w:proofErr w:type="gramStart"/>
+              <w:t xml:space="preserve">  </w:t>
+            </w:r>
+            <w:proofErr w:type="gramEnd"/>
             <w:r>
               <w:rPr>
                 <w:b/>
                 <w:bCs/>
                 <w:color w:val="F59E0B"/>
               </w:rPr>
-              <w:t xml:space="preserve">  </w:t>
-            </w:r>
-            <w:proofErr w:type="gramEnd"/>
-            <w:r>
-              <w:rPr>
-                <w:b/>
-                <w:bCs/>
-                <w:color w:val="F59E0B"/>
-              </w:rPr>
               <w:t>Atenção</w:t>
             </w:r>
           </w:p>
@@ -1564,14 +1548,7 @@
                 <w:sz w:val="21"/>
                 <w:szCs w:val="21"/>
               </w:rPr>
-              <w:t xml:space="preserve"> bem-sucedido, a API Vulnerável pode ficar offline p</w:t>
-            </w:r>
-            <w:r>
-              <w:rPr>
-                <w:sz w:val="21"/>
-                <w:szCs w:val="21"/>
-              </w:rPr>
-              <w:t xml:space="preserve">or 30–60 segundos enquanto se recupera. Aguarde o </w:t>
+              <w:t xml:space="preserve"> bem-sucedido, a API Vulnerável pode ficar offline por 30–60 segundos enquanto se recupera. Aguarde o </w:t>
             </w:r>
             <w:proofErr w:type="gramStart"/>
             <w:r>
@@ -2095,15 +2072,7 @@
           <w:bCs/>
           <w:color w:val="0D1117"/>
         </w:rPr>
-        <w:t>↻</w:t>
-      </w:r>
-      <w:r>
-        <w:rPr>
-          <w:b/>
-          <w:bCs/>
-          <w:color w:val="0D1117"/>
-        </w:rPr>
-        <w:t xml:space="preserve"> Atualizar</w:t>
+        <w:t>↻ Atualizar</w:t>
       </w:r>
       <w:r>
         <w:t xml:space="preserve"> para forçar verificação imediata.</w:t>
@@ -2123,10 +2092,7 @@
       </w:pPr>
       <w:r>
         <w:lastRenderedPageBreak/>
-        <w:t>3. Página: Visão Gera</w:t>
-      </w:r>
-      <w:r>
-        <w:t>l</w:t>
+        <w:t>3. Página: Visão Geral</w:t>
       </w:r>
     </w:p>
     <w:p>
@@ -2431,21 +2397,7 @@
                 <w:sz w:val="20"/>
                 <w:szCs w:val="20"/>
               </w:rPr>
-              <w:t>❌</w:t>
-            </w:r>
-            <w:r>
-              <w:rPr>
-                <w:sz w:val="20"/>
-                <w:szCs w:val="20"/>
-              </w:rPr>
-              <w:t xml:space="preserve"> </w:t>
-            </w:r>
-            <w:r>
-              <w:rPr>
-                <w:sz w:val="20"/>
-                <w:szCs w:val="20"/>
-              </w:rPr>
-              <w:t>Desativado</w:t>
+              <w:t>❌ Desativado</w:t>
             </w:r>
           </w:p>
         </w:tc>
@@ -2472,14 +2424,7 @@
                 <w:sz w:val="20"/>
                 <w:szCs w:val="20"/>
               </w:rPr>
-              <w:t>✅</w:t>
-            </w:r>
-            <w:r>
-              <w:rPr>
-                <w:sz w:val="20"/>
-                <w:szCs w:val="20"/>
-              </w:rPr>
-              <w:t xml:space="preserve"> </w:t>
+              <w:t xml:space="preserve">✅ </w:t>
             </w:r>
             <w:proofErr w:type="gramStart"/>
             <w:r>
@@ -2567,14 +2512,7 @@
                 <w:sz w:val="20"/>
                 <w:szCs w:val="20"/>
               </w:rPr>
-              <w:t>❌</w:t>
-            </w:r>
-            <w:r>
-              <w:rPr>
-                <w:sz w:val="20"/>
-                <w:szCs w:val="20"/>
-              </w:rPr>
-              <w:t xml:space="preserve"> Não</w:t>
+              <w:t>❌ Não</w:t>
             </w:r>
           </w:p>
         </w:tc>
@@ -2601,14 +2539,7 @@
                 <w:sz w:val="20"/>
                 <w:szCs w:val="20"/>
               </w:rPr>
-              <w:t>✅</w:t>
-            </w:r>
-            <w:r>
-              <w:rPr>
-                <w:sz w:val="20"/>
-                <w:szCs w:val="20"/>
-              </w:rPr>
-              <w:t xml:space="preserve"> </w:t>
+              <w:t xml:space="preserve">✅ </w:t>
             </w:r>
             <w:proofErr w:type="gramStart"/>
             <w:r>
@@ -2924,10 +2855,7 @@
       </w:r>
       <w:proofErr w:type="gramEnd"/>
       <w:r>
-        <w:t xml:space="preserve"> de </w:t>
-      </w:r>
-      <w:r>
-        <w:t>Arquitetura</w:t>
+        <w:t xml:space="preserve"> de Arquitetura</w:t>
       </w:r>
     </w:p>
     <w:p>
@@ -2991,10 +2919,7 @@
         <w:spacing w:before="60" w:after="80"/>
       </w:pPr>
       <w:r>
-        <w:t>Botões de atalho para iniciar ataqu</w:t>
-      </w:r>
-      <w:r>
-        <w:t>es diretamente sem navegar até a página de Ataques:</w:t>
+        <w:t>Botões de atalho para iniciar ataques diretamente sem navegar até a página de Ataques:</w:t>
       </w:r>
     </w:p>
     <w:p>
@@ -3248,10 +3173,7 @@
       </w:r>
       <w:proofErr w:type="spellEnd"/>
       <w:r>
-        <w:t xml:space="preserve"> For</w:t>
-      </w:r>
-      <w:r>
-        <w:t>ce)</w:t>
+        <w:t xml:space="preserve"> Force)</w:t>
       </w:r>
     </w:p>
     <w:tbl>
@@ -4213,16 +4135,7 @@
                 <w:sz w:val="19"/>
                 <w:szCs w:val="19"/>
               </w:rPr>
-              <w:t xml:space="preserve">" → </w:t>
-            </w:r>
-            <w:r>
-              <w:rPr>
-                <w:rFonts w:ascii="Courier New" w:eastAsia="Courier New" w:hAnsi="Courier New" w:cs="Courier New"/>
-                <w:color w:val="58D1A5"/>
-                <w:sz w:val="19"/>
-                <w:szCs w:val="19"/>
-              </w:rPr>
-              <w:t>401 (0.72s)</w:t>
+              <w:t>" → 401 (0.72s)</w:t>
             </w:r>
           </w:p>
           <w:p>
@@ -4473,14 +4386,7 @@
                 <w:sz w:val="20"/>
                 <w:szCs w:val="20"/>
               </w:rPr>
-              <w:t xml:space="preserve">Senha </w:t>
-            </w:r>
-            <w:r>
-              <w:rPr>
-                <w:sz w:val="20"/>
-                <w:szCs w:val="20"/>
-              </w:rPr>
-              <w:t>encontrada</w:t>
+              <w:t>Senha encontrada</w:t>
             </w:r>
           </w:p>
         </w:tc>
@@ -4507,14 +4413,7 @@
                 <w:sz w:val="20"/>
                 <w:szCs w:val="20"/>
               </w:rPr>
-              <w:t>🔓</w:t>
-            </w:r>
-            <w:r>
-              <w:rPr>
-                <w:sz w:val="20"/>
-                <w:szCs w:val="20"/>
-              </w:rPr>
-              <w:t xml:space="preserve"> Senha encontrada: "</w:t>
+              <w:t>🔓 Senha encontrada: "</w:t>
             </w:r>
             <w:proofErr w:type="spellStart"/>
             <w:r>
@@ -4613,21 +4512,7 @@
                 <w:sz w:val="20"/>
                 <w:szCs w:val="20"/>
               </w:rPr>
-              <w:t>🛡</w:t>
-            </w:r>
-            <w:r>
-              <w:rPr>
-                <w:sz w:val="20"/>
-                <w:szCs w:val="20"/>
-              </w:rPr>
-              <w:t>️</w:t>
-            </w:r>
-            <w:r>
-              <w:rPr>
-                <w:sz w:val="20"/>
-                <w:szCs w:val="20"/>
-              </w:rPr>
-              <w:t xml:space="preserve"> IP bloqueado após N tentativas</w:t>
+              <w:t>🛡️ IP bloqueado após N tentativas</w:t>
             </w:r>
           </w:p>
         </w:tc>
@@ -4710,14 +4595,7 @@
                 <w:sz w:val="20"/>
                 <w:szCs w:val="20"/>
               </w:rPr>
-              <w:t>❌</w:t>
-            </w:r>
-            <w:r>
-              <w:rPr>
-                <w:sz w:val="20"/>
-                <w:szCs w:val="20"/>
-              </w:rPr>
-              <w:t xml:space="preserve"> Senha não encontrada em N tentativas</w:t>
+              <w:t>❌ Senha não encontrada em N tentativas</w:t>
             </w:r>
           </w:p>
         </w:tc>
@@ -4769,10 +4647,7 @@
         <w:pStyle w:val="Ttulo3"/>
       </w:pPr>
       <w:r>
-        <w:t xml:space="preserve">Métricas </w:t>
-      </w:r>
-      <w:r>
-        <w:t>exibidas</w:t>
+        <w:t>Métricas exibidas</w:t>
       </w:r>
     </w:p>
     <w:p>
@@ -4960,14 +4835,7 @@
                 <w:sz w:val="21"/>
                 <w:szCs w:val="21"/>
               </w:rPr>
-              <w:t xml:space="preserve"> padrão </w:t>
-            </w:r>
-            <w:r>
-              <w:rPr>
-                <w:sz w:val="21"/>
-                <w:szCs w:val="21"/>
-              </w:rPr>
-              <w:t>(senhas comuns em inglês) não contém "</w:t>
+              <w:t xml:space="preserve"> padrão (senhas comuns em inglês) não contém "</w:t>
             </w:r>
             <w:proofErr w:type="spellStart"/>
             <w:r>
@@ -5697,10 +5565,7 @@
       </w:r>
       <w:proofErr w:type="spellEnd"/>
       <w:r>
-        <w:t xml:space="preserve"> bloqueia com 429 as requisiçõe</w:t>
-      </w:r>
-      <w:r>
-        <w:t xml:space="preserve">s que excedem </w:t>
+        <w:t xml:space="preserve"> bloqueia com 429 as requisições que excedem </w:t>
       </w:r>
       <w:proofErr w:type="gramStart"/>
       <w:r>
@@ -5899,16 +5764,7 @@
                 <w:sz w:val="19"/>
                 <w:szCs w:val="19"/>
               </w:rPr>
-              <w:t>c</w:t>
-            </w:r>
-            <w:r>
-              <w:rPr>
-                <w:rFonts w:ascii="Courier New" w:eastAsia="Courier New" w:hAnsi="Courier New" w:cs="Courier New"/>
-                <w:color w:val="58D1A5"/>
-                <w:sz w:val="19"/>
-                <w:szCs w:val="19"/>
-              </w:rPr>
-              <w:t>odes</w:t>
+              <w:t>codes</w:t>
             </w:r>
             <w:proofErr w:type="spellEnd"/>
             <w:r>
@@ -6590,10 +6446,7 @@
         <w:pStyle w:val="Ttulo3"/>
       </w:pPr>
       <w:r>
-        <w:t xml:space="preserve">Métricas do </w:t>
-      </w:r>
-      <w:r>
-        <w:t>resultado final</w:t>
+        <w:t>Métricas do resultado final</w:t>
       </w:r>
     </w:p>
     <w:p>
@@ -6703,15 +6556,7 @@
           <w:bCs/>
           <w:color w:val="0D1117"/>
         </w:rPr>
-        <w:t>Gráfico de barras:</w:t>
-      </w:r>
-      <w:r>
-        <w:rPr>
-          <w:b/>
-          <w:bCs/>
-          <w:color w:val="0D1117"/>
-        </w:rPr>
-        <w:t xml:space="preserve"> </w:t>
+        <w:t xml:space="preserve">Gráfico de barras: </w:t>
       </w:r>
       <w:r>
         <w:t>proporção visual de cada código HTTP</w:t>
@@ -6917,14 +6762,7 @@
                 <w:sz w:val="20"/>
                 <w:szCs w:val="20"/>
               </w:rPr>
-              <w:t>💣</w:t>
-            </w:r>
-            <w:r>
-              <w:rPr>
-                <w:sz w:val="20"/>
-                <w:szCs w:val="20"/>
-              </w:rPr>
-              <w:t xml:space="preserve"> API sobrecarregada (60+ timeouts)</w:t>
+              <w:t>💣 API sobrecarregada (60+ timeouts)</w:t>
             </w:r>
           </w:p>
         </w:tc>
@@ -7018,21 +6856,7 @@
                 <w:sz w:val="20"/>
                 <w:szCs w:val="20"/>
               </w:rPr>
-              <w:t>🛡</w:t>
-            </w:r>
-            <w:r>
-              <w:rPr>
-                <w:sz w:val="20"/>
-                <w:szCs w:val="20"/>
-              </w:rPr>
-              <w:t>️</w:t>
-            </w:r>
-            <w:r>
-              <w:rPr>
-                <w:sz w:val="20"/>
-                <w:szCs w:val="20"/>
-              </w:rPr>
-              <w:t xml:space="preserve"> Rate </w:t>
+              <w:t xml:space="preserve">🛡️ Rate </w:t>
             </w:r>
             <w:proofErr w:type="spellStart"/>
             <w:r>
@@ -7522,14 +7346,7 @@
                 <w:sz w:val="20"/>
                 <w:szCs w:val="20"/>
               </w:rPr>
-              <w:t xml:space="preserve">Logs da API </w:t>
-            </w:r>
-            <w:r>
-              <w:rPr>
-                <w:sz w:val="20"/>
-                <w:szCs w:val="20"/>
-              </w:rPr>
-              <w:t>protegida com indicação de bloqueios</w:t>
+              <w:t>Logs da API protegida com indicação de bloqueios</w:t>
             </w:r>
           </w:p>
         </w:tc>
@@ -7640,21 +7457,10 @@
           <w:bCs/>
           <w:color w:val="0D1117"/>
         </w:rPr>
-        <w:t>↻</w:t>
-      </w:r>
-      <w:r>
-        <w:rPr>
-          <w:b/>
-          <w:bCs/>
-          <w:color w:val="0D1117"/>
-        </w:rPr>
-        <w:t xml:space="preserve"> Atualizar: </w:t>
-      </w:r>
-      <w:r>
-        <w:t xml:space="preserve">recarrega o arquivo de log do servidor (até 300 </w:t>
-      </w:r>
-      <w:r>
-        <w:t>últimas linhas)</w:t>
+        <w:t xml:space="preserve">↻ Atualizar: </w:t>
+      </w:r>
+      <w:r>
+        <w:t>recarrega o arquivo de log do servidor (até 300 últimas linhas)</w:t>
       </w:r>
     </w:p>
     <w:p>
@@ -7874,14 +7680,7 @@
                 <w:sz w:val="20"/>
                 <w:szCs w:val="20"/>
               </w:rPr>
-              <w:t>🟢</w:t>
-            </w:r>
-            <w:r>
-              <w:rPr>
-                <w:sz w:val="20"/>
-                <w:szCs w:val="20"/>
-              </w:rPr>
-              <w:t xml:space="preserve"> Verde</w:t>
+              <w:t>🟢 Verde</w:t>
             </w:r>
           </w:p>
         </w:tc>
@@ -7964,14 +7763,7 @@
                 <w:sz w:val="20"/>
                 <w:szCs w:val="20"/>
               </w:rPr>
-              <w:t>🟡</w:t>
-            </w:r>
-            <w:r>
-              <w:rPr>
-                <w:sz w:val="20"/>
-                <w:szCs w:val="20"/>
-              </w:rPr>
-              <w:t xml:space="preserve"> Amarelo</w:t>
+              <w:t>🟡 Amarelo</w:t>
             </w:r>
           </w:p>
         </w:tc>
@@ -8063,14 +7855,7 @@
                 <w:sz w:val="20"/>
                 <w:szCs w:val="20"/>
               </w:rPr>
-              <w:t>🔴</w:t>
-            </w:r>
-            <w:r>
-              <w:rPr>
-                <w:sz w:val="20"/>
-                <w:szCs w:val="20"/>
-              </w:rPr>
-              <w:t xml:space="preserve"> Vermelho</w:t>
+              <w:t>🔴 Vermelho</w:t>
             </w:r>
           </w:p>
         </w:tc>
@@ -8162,14 +7947,7 @@
                 <w:sz w:val="20"/>
                 <w:szCs w:val="20"/>
               </w:rPr>
-              <w:t>🟣</w:t>
-            </w:r>
-            <w:r>
-              <w:rPr>
-                <w:sz w:val="20"/>
-                <w:szCs w:val="20"/>
-              </w:rPr>
-              <w:t xml:space="preserve"> Roxo</w:t>
+              <w:t>🟣 Roxo</w:t>
             </w:r>
           </w:p>
         </w:tc>
@@ -8309,14 +8087,7 @@
                 <w:sz w:val="20"/>
                 <w:szCs w:val="20"/>
               </w:rPr>
-              <w:t>🔴</w:t>
-            </w:r>
-            <w:r>
-              <w:rPr>
-                <w:sz w:val="20"/>
-                <w:szCs w:val="20"/>
-              </w:rPr>
-              <w:t xml:space="preserve"> Vermelho</w:t>
+              <w:t>🔴 Vermelho</w:t>
             </w:r>
           </w:p>
         </w:tc>
@@ -8424,10 +8195,7 @@
         <w:spacing w:before="60" w:after="80"/>
       </w:pPr>
       <w:r>
-        <w:t xml:space="preserve">Durante e após cada ataque, os logs </w:t>
-      </w:r>
-      <w:r>
-        <w:t>mostram padrões distintos:</w:t>
+        <w:t>Durante e após cada ataque, os logs mostram padrões distintos:</w:t>
       </w:r>
     </w:p>
     <w:p>
@@ -8530,10 +8298,7 @@
       </w:r>
       <w:proofErr w:type="spellEnd"/>
       <w:r>
-        <w:t>, depois</w:t>
-      </w:r>
-      <w:r>
-        <w:t xml:space="preserve"> erros 500 ou ausência de respostas</w:t>
+        <w:t>, depois erros 500 ou ausência de respostas</w:t>
       </w:r>
     </w:p>
     <w:p>
@@ -8600,10 +8365,7 @@
         <w:spacing w:before="60" w:after="80"/>
       </w:pPr>
       <w:r>
-        <w:t>Lista todos os ataques já executados na sessão, com dados detalhados armazenados em arquivo</w:t>
-      </w:r>
-      <w:r>
-        <w:t>s JSON.</w:t>
+        <w:t>Lista todos os ataques já executados na sessão, com dados detalhados armazenados em arquivos JSON.</w:t>
       </w:r>
     </w:p>
     <w:p>
@@ -9041,14 +8803,7 @@
                 <w:sz w:val="20"/>
                 <w:szCs w:val="20"/>
               </w:rPr>
-              <w:t xml:space="preserve">encontrado ou "Não </w:t>
-            </w:r>
-            <w:r>
-              <w:rPr>
-                <w:sz w:val="20"/>
-                <w:szCs w:val="20"/>
-              </w:rPr>
-              <w:t>achada"</w:t>
+              <w:t>encontrado ou "Não achada"</w:t>
             </w:r>
             <w:proofErr w:type="gramEnd"/>
           </w:p>
@@ -9385,14 +9140,7 @@
                 <w:sz w:val="20"/>
                 <w:szCs w:val="20"/>
               </w:rPr>
-              <w:t xml:space="preserve">Média de tempo de resposta por </w:t>
-            </w:r>
-            <w:r>
-              <w:rPr>
-                <w:sz w:val="20"/>
-                <w:szCs w:val="20"/>
-              </w:rPr>
-              <w:t>requisição</w:t>
+              <w:t>Média de tempo de resposta por requisição</w:t>
             </w:r>
           </w:p>
         </w:tc>
@@ -9616,14 +9364,7 @@
                 <w:sz w:val="20"/>
                 <w:szCs w:val="20"/>
               </w:rPr>
-              <w:t xml:space="preserve">Distribuição de 200 / 429 / 0 com barras </w:t>
-            </w:r>
-            <w:r>
-              <w:rPr>
-                <w:sz w:val="20"/>
-                <w:szCs w:val="20"/>
-              </w:rPr>
-              <w:t>coloridas</w:t>
+              <w:t>Distribuição de 200 / 429 / 0 com barras coloridas</w:t>
             </w:r>
           </w:p>
         </w:tc>
@@ -9733,8 +9474,6 @@
       <w:r>
         <w:t xml:space="preserve"> comparativos.</w:t>
       </w:r>
-      <w:bookmarkStart w:id="0" w:name="_GoBack"/>
-      <w:bookmarkEnd w:id="0"/>
       <w:r>
         <w:br w:type="page"/>
       </w:r>
@@ -9806,10 +9545,7 @@
       </w:r>
       <w:proofErr w:type="spellEnd"/>
       <w:r>
-        <w:t xml:space="preserve"> D</w:t>
-      </w:r>
-      <w:r>
-        <w:t>isponíveis</w:t>
+        <w:t xml:space="preserve"> Disponíveis</w:t>
       </w:r>
     </w:p>
     <w:tbl>
@@ -10576,16 +10312,7 @@
           <w:sz w:val="20"/>
           <w:szCs w:val="20"/>
         </w:rPr>
-        <w:t xml:space="preserve">{"status": "ok", "modo": </w:t>
-      </w:r>
-      <w:r>
-        <w:rPr>
-          <w:rFonts w:ascii="Courier New" w:eastAsia="Courier New" w:hAnsi="Courier New" w:cs="Courier New"/>
-          <w:color w:val="3B9EFF"/>
-          <w:sz w:val="20"/>
-          <w:szCs w:val="20"/>
-        </w:rPr>
-        <w:t>"VULNERÁVEL"}</w:t>
+        <w:t>{"status": "ok", "modo": "VULNERÁVEL"}</w:t>
       </w:r>
       <w:r>
         <w:t xml:space="preserve"> ou </w:t>
@@ -10826,16 +10553,7 @@
           <w:sz w:val="20"/>
           <w:szCs w:val="20"/>
         </w:rPr>
-        <w:t>{"erro": "Cre</w:t>
-      </w:r>
-      <w:r>
-        <w:rPr>
-          <w:rFonts w:ascii="Courier New" w:eastAsia="Courier New" w:hAnsi="Courier New" w:cs="Courier New"/>
-          <w:color w:val="3B9EFF"/>
-          <w:sz w:val="20"/>
-          <w:szCs w:val="20"/>
-        </w:rPr>
-        <w:t>denciais inválidas"}</w:t>
+        <w:t>{"erro": "Credenciais inválidas"}</w:t>
       </w:r>
     </w:p>
     <w:p>
@@ -11000,10 +10718,7 @@
         <w:pStyle w:val="Ttulo3"/>
       </w:pPr>
       <w:r>
-        <w:t xml:space="preserve">POST /login — </w:t>
-      </w:r>
-      <w:r>
-        <w:t>Teste de Bloqueio (botão especial)</w:t>
+        <w:t>POST /login — Teste de Bloqueio (botão especial)</w:t>
       </w:r>
     </w:p>
     <w:p>
@@ -11275,14 +10990,7 @@
                 <w:sz w:val="20"/>
                 <w:szCs w:val="20"/>
               </w:rPr>
-              <w:t>🟢</w:t>
-            </w:r>
-            <w:r>
-              <w:rPr>
-                <w:sz w:val="20"/>
-                <w:szCs w:val="20"/>
-              </w:rPr>
-              <w:t xml:space="preserve"> Verde</w:t>
+              <w:t>🟢 Verde</w:t>
             </w:r>
           </w:p>
         </w:tc>
@@ -11365,14 +11073,7 @@
                 <w:sz w:val="20"/>
                 <w:szCs w:val="20"/>
               </w:rPr>
-              <w:t>🔴</w:t>
-            </w:r>
-            <w:r>
-              <w:rPr>
-                <w:sz w:val="20"/>
-                <w:szCs w:val="20"/>
-              </w:rPr>
-              <w:t xml:space="preserve"> Vermelho</w:t>
+              <w:t>🔴 Vermelho</w:t>
             </w:r>
           </w:p>
         </w:tc>
@@ -11464,14 +11165,7 @@
                 <w:sz w:val="20"/>
                 <w:szCs w:val="20"/>
               </w:rPr>
-              <w:t>🔴</w:t>
-            </w:r>
-            <w:r>
-              <w:rPr>
-                <w:sz w:val="20"/>
-                <w:szCs w:val="20"/>
-              </w:rPr>
-              <w:t xml:space="preserve"> Vermelho</w:t>
+              <w:t>🔴 Vermelho</w:t>
             </w:r>
           </w:p>
         </w:tc>
@@ -11570,21 +11264,7 @@
                 <w:sz w:val="20"/>
                 <w:szCs w:val="20"/>
               </w:rPr>
-              <w:t>🔴</w:t>
-            </w:r>
-            <w:r>
-              <w:rPr>
-                <w:sz w:val="20"/>
-                <w:szCs w:val="20"/>
-              </w:rPr>
-              <w:t xml:space="preserve"> </w:t>
-            </w:r>
-            <w:r>
-              <w:rPr>
-                <w:sz w:val="20"/>
-                <w:szCs w:val="20"/>
-              </w:rPr>
-              <w:t>Vermelho</w:t>
+              <w:t>🔴 Vermelho</w:t>
             </w:r>
           </w:p>
         </w:tc>
@@ -11676,14 +11356,7 @@
                 <w:sz w:val="20"/>
                 <w:szCs w:val="20"/>
               </w:rPr>
-              <w:t>🔴</w:t>
-            </w:r>
-            <w:r>
-              <w:rPr>
-                <w:sz w:val="20"/>
-                <w:szCs w:val="20"/>
-              </w:rPr>
-              <w:t xml:space="preserve"> Vermelho</w:t>
+              <w:t>🔴 Vermelho</w:t>
             </w:r>
           </w:p>
         </w:tc>
@@ -11772,10 +11445,7 @@
         <w:t xml:space="preserve">Visão Geral: </w:t>
       </w:r>
       <w:r>
-        <w:t xml:space="preserve">mostre o </w:t>
-      </w:r>
-      <w:r>
-        <w:t>diagrama de arquitetura e explique os dois modos de API</w:t>
+        <w:t>mostre o diagrama de arquitetura e explique os dois modos de API</w:t>
       </w:r>
     </w:p>
     <w:p>
@@ -12060,10 +11730,7 @@
         <w:t xml:space="preserve"> na Vulnerável: </w:t>
       </w:r>
       <w:r>
-        <w:t xml:space="preserve">execute — mostre timeouts e </w:t>
-      </w:r>
-      <w:r>
-        <w:t>API possivelmente caindo</w:t>
+        <w:t>execute — mostre timeouts e API possivelmente caindo</w:t>
       </w:r>
     </w:p>
     <w:p>
@@ -12147,10 +11814,7 @@
       </w:r>
       <w:proofErr w:type="spellEnd"/>
       <w:r>
-        <w:t xml:space="preserve"> em ambas as APIs para senti</w:t>
-      </w:r>
-      <w:r>
-        <w:t>r a diferença de resposta</w:t>
+        <w:t xml:space="preserve"> em ambas as APIs para sentir a diferença de resposta</w:t>
       </w:r>
     </w:p>
     <w:p>
@@ -12316,14 +11980,7 @@
                 <w:sz w:val="21"/>
                 <w:szCs w:val="21"/>
               </w:rPr>
-              <w:t>/s é suficiente? Quais outros meca</w:t>
-            </w:r>
-            <w:r>
-              <w:rPr>
-                <w:sz w:val="21"/>
-                <w:szCs w:val="21"/>
-              </w:rPr>
-              <w:t>nismos poderiam complementar?</w:t>
+              <w:t>/s é suficiente? Quais outros mecanismos poderiam complementar?</w:t>
             </w:r>
           </w:p>
           <w:p>
@@ -12411,10 +12068,7 @@
       </w:pPr>
       <w:r>
         <w:lastRenderedPageBreak/>
-        <w:t xml:space="preserve">9. Referência </w:t>
-      </w:r>
-      <w:r>
-        <w:t>Rápida</w:t>
+        <w:t>9. Referência Rápida</w:t>
       </w:r>
     </w:p>
     <w:p>
@@ -12876,14 +12530,7 @@
                 <w:sz w:val="20"/>
                 <w:szCs w:val="20"/>
               </w:rPr>
-              <w:t>api-</w:t>
-            </w:r>
-            <w:r>
-              <w:rPr>
-                <w:sz w:val="20"/>
-                <w:szCs w:val="20"/>
-              </w:rPr>
-              <w:t>vulneravel</w:t>
+              <w:t>api-vulneravel</w:t>
             </w:r>
             <w:proofErr w:type="spellEnd"/>
           </w:p>
@@ -14314,14 +13961,7 @@
                 <w:sz w:val="20"/>
                 <w:szCs w:val="20"/>
               </w:rPr>
-              <w:t xml:space="preserve"> </w:t>
-            </w:r>
-            <w:r>
-              <w:rPr>
-                <w:sz w:val="20"/>
-                <w:szCs w:val="20"/>
-              </w:rPr>
-              <w:t>(timeout/</w:t>
+              <w:t xml:space="preserve"> (timeout/</w:t>
             </w:r>
             <w:proofErr w:type="spellStart"/>
             <w:r>
@@ -15182,14 +14822,7 @@
                 <w:sz w:val="21"/>
                 <w:szCs w:val="21"/>
               </w:rPr>
-              <w:t xml:space="preserve"> tentativas falhas, o IP é bloqueado por 60 </w:t>
-            </w:r>
-            <w:r>
-              <w:rPr>
-                <w:sz w:val="21"/>
-                <w:szCs w:val="21"/>
-              </w:rPr>
-              <w:t>segundos</w:t>
+              <w:t xml:space="preserve"> tentativas falhas, o IP é bloqueado por 60 segundos</w:t>
             </w:r>
           </w:p>
           <w:p>
@@ -15464,7 +15097,7 @@
         <w:sz w:val="18"/>
         <w:szCs w:val="18"/>
       </w:rPr>
-      <w:t>11</w:t>
+      <w:t>1</w:t>
     </w:r>
     <w:r>
       <w:rPr>
@@ -16803,7 +16436,7 @@
   <a:extraClrSchemeLst/>
   <a:extLst>
     <a:ext uri="{05A4C25C-085E-4340-85A3-A5531E510DB2}">
-      <thm15:themeFamily xmlns:thm15="http://schemas.microsoft.com/office/thememl/2012/main" xmlns="" name="Office Theme" id="{2E142A2C-CD16-42D6-873A-C26D2A0506FA}" vid="{1BDDFF52-6CD6-40A5-AB3C-68EB2F1E4D0A}"/>
+      <thm15:themeFamily xmlns="" xmlns:thm15="http://schemas.microsoft.com/office/thememl/2012/main" name="Office Theme" id="{2E142A2C-CD16-42D6-873A-C26D2A0506FA}" vid="{1BDDFF52-6CD6-40A5-AB3C-68EB2F1E4D0A}"/>
     </a:ext>
   </a:extLst>
 </a:theme>

</xml_diff>